<commit_message>
Details aus Spezifikation entfernt
</commit_message>
<xml_diff>
--- a/01_Spezifikation/IWR6843AOPEVM People Tracking Spezifikation.docx
+++ b/01_Spezifikation/IWR6843AOPEVM People Tracking Spezifikation.docx
@@ -8826,7 +8826,6 @@
         <w:pStyle w:val="berschrift3"/>
       </w:pPr>
       <w:r>
-        <w:lastRenderedPageBreak/>
         <w:t>TLV 1020 – Compressed Points (</w:t>
       </w:r>
       <w:proofErr w:type="spellStart"/>
@@ -11280,7 +11279,6 @@
               <w:rPr>
                 <w:lang w:val="de-DE"/>
               </w:rPr>
-              <w:lastRenderedPageBreak/>
               <w:t>108</w:t>
             </w:r>
           </w:p>
@@ -11368,6 +11366,7 @@
         <w:rPr>
           <w:lang w:val="de-DE"/>
         </w:rPr>
+        <w:lastRenderedPageBreak/>
         <w:t>Koordinaten: World Space (Ursprung auf dem Boden)</w:t>
       </w:r>
     </w:p>
@@ -12265,28 +12264,41 @@
     <w:p>
       <w:pPr>
         <w:jc w:val="both"/>
-      </w:pPr>
-      <w:proofErr w:type="spellStart"/>
-      <w:r>
-        <w:t>Länge</w:t>
-      </w:r>
-      <w:proofErr w:type="spellEnd"/>
-      <w:r>
-        <w:t>:</w:t>
-      </w:r>
-      <w:r>
+        <w:rPr>
+          <w:lang w:val="de-DE"/>
+        </w:rPr>
+      </w:pPr>
+      <w:r>
+        <w:rPr>
+          <w:lang w:val="de-DE"/>
+        </w:rPr>
+        <w:t>Länge:</w:t>
+      </w:r>
+      <w:r>
+        <w:rPr>
+          <w:lang w:val="de-DE"/>
+        </w:rPr>
         <w:tab/>
       </w:r>
       <w:r>
+        <w:rPr>
+          <w:lang w:val="de-DE"/>
+        </w:rPr>
         <w:tab/>
       </w:r>
       <w:r>
+        <w:rPr>
+          <w:lang w:val="de-DE"/>
+        </w:rPr>
         <w:t>4 Bytes</w:t>
       </w:r>
     </w:p>
     <w:p>
       <w:pPr>
         <w:jc w:val="both"/>
+        <w:rPr>
+          <w:lang w:val="de-DE"/>
+        </w:rPr>
       </w:pPr>
     </w:p>
     <w:p>
@@ -12491,7 +12503,6 @@
         <w:rPr>
           <w:lang w:val="de-DE"/>
         </w:rPr>
-        <w:lastRenderedPageBreak/>
         <w:t>TLV Type</w:t>
       </w:r>
       <w:proofErr w:type="gramEnd"/>
@@ -12553,6 +12564,7 @@
         <w:rPr>
           <w:lang w:val="de-DE"/>
         </w:rPr>
+        <w:lastRenderedPageBreak/>
         <w:t xml:space="preserve">Falls eine Validierungsprüfung fehlschlägt, wird </w:t>
       </w:r>
       <w:r>
@@ -13408,7 +13420,6 @@
         <w:jc w:val="both"/>
       </w:pPr>
       <w:r>
-        <w:lastRenderedPageBreak/>
         <w:t>Presence-Detection-Zone</w:t>
       </w:r>
     </w:p>
@@ -13469,6 +13480,7 @@
       </w:pPr>
       <w:proofErr w:type="spellStart"/>
       <w:r>
+        <w:lastRenderedPageBreak/>
         <w:t>frameCfg</w:t>
       </w:r>
       <w:proofErr w:type="spellEnd"/>
@@ -15068,7 +15080,6 @@
                 <w:bCs w:val="0"/>
                 <w:lang w:val="de-DE"/>
               </w:rPr>
-              <w:lastRenderedPageBreak/>
               <w:t>Configuration</w:t>
             </w:r>
             <w:proofErr w:type="spellEnd"/>
@@ -15225,6 +15236,7 @@
         <w:rPr>
           <w:lang w:val="de-DE"/>
         </w:rPr>
+        <w:lastRenderedPageBreak/>
         <w:t>Bei Verlust der Synchronisation:</w:t>
       </w:r>
     </w:p>
@@ -16238,7 +16250,6 @@
         <w:rPr>
           <w:lang w:val="de-DE"/>
         </w:rPr>
-        <w:lastRenderedPageBreak/>
         <w:t>Max. Speicher:</w:t>
       </w:r>
       <w:r>
@@ -16327,6 +16338,7 @@
               <w:rPr>
                 <w:lang w:val="de-DE"/>
               </w:rPr>
+              <w:lastRenderedPageBreak/>
               <w:t>Test</w:t>
             </w:r>
           </w:p>
@@ -17490,7 +17502,6 @@
                 <w:bCs w:val="0"/>
                 <w:lang w:val="de-DE"/>
               </w:rPr>
-              <w:lastRenderedPageBreak/>
               <w:t>World Space</w:t>
             </w:r>
           </w:p>
@@ -17790,6 +17801,7 @@
                 <w:bCs w:val="0"/>
                 <w:lang w:val="de-DE"/>
               </w:rPr>
+              <w:lastRenderedPageBreak/>
               <w:t>Clutter</w:t>
             </w:r>
           </w:p>
@@ -17916,9 +17928,6 @@
     <w:p>
       <w:pPr>
         <w:jc w:val="both"/>
-        <w:rPr>
-          <w:lang w:val="de-DE"/>
-        </w:rPr>
       </w:pPr>
     </w:p>
     <w:p>
@@ -18199,20 +18208,6 @@
       </w:rPr>
     </w:sdtEndPr>
     <w:sdtContent>
-      <w:p>
-        <w:pPr>
-          <w:jc w:val="center"/>
-        </w:pPr>
-        <w:r>
-          <w:t>©Smart Nanotubes Technologies GmbH 202</w:t>
-        </w:r>
-        <w:r>
-          <w:t>4</w:t>
-        </w:r>
-        <w:r>
-          <w:t>. All right reserved.</w:t>
-        </w:r>
-      </w:p>
       <w:p>
         <w:pPr>
           <w:jc w:val="center"/>
@@ -21123,6 +21118,7 @@
   <w:style w:type="character" w:default="1" w:styleId="Absatz-Standardschriftart">
     <w:name w:val="Default Paragraph Font"/>
     <w:uiPriority w:val="1"/>
+    <w:semiHidden/>
     <w:unhideWhenUsed/>
   </w:style>
   <w:style w:type="table" w:default="1" w:styleId="NormaleTabelle">

</xml_diff>